<commit_message>
Add EC hydrology overlays and bulk EC terminology
</commit_message>
<xml_diff>
--- a/biochar_app/markdown/docx/techDetails_updated.docx
+++ b/biochar_app/markdown/docx/techDetails_updated.docx
@@ -144,7 +144,7 @@
     </w:p>
     <w:p>
       <w:r>
-        <w:t>Electrical conductivity is determined by exciting the rods with a known non-polarizing waveform and measuring the signal attenuation. Signal attenuation is reported as a dimensionless voltage ratio, which is the ratio of the excitation voltage to the measured voltage along the sensor rods when they are excited at a fixed 100 kHz frequency. Voltage ratio ranges from 1 in nonconductive media to about 17 in highly conductive media. Values greater than 17 are highly unstable and indicate that the soil conditions are outside of the specified operating range of the sensor.</w:t>
+        <w:t>Bulk electrical conductivity is determined by exciting the rods with a known non-polarizing waveform and measuring the signal attenuation. Signal attenuation is reported as a dimensionless voltage ratio, which is the ratio of the excitation voltage to the measured voltage along the sensor rods when they are excited at a fixed 100 kHz frequency. Voltage ratio ranges from 1 in nonconductive media to about 17 in highly conductive media. Values greater than 17 are highly unstable and indicate that the soil conditions are outside of the specified operating range of the sensor. Because this is a bulk-soil measurement, the reported EC depends on soil water content and temperature and is not equivalent to pore-water EC or laboratory extract EC.</w:t>
       </w:r>
     </w:p>
     <w:p>
@@ -366,7 +366,7 @@
     </w:p>
     <w:p>
       <w:r>
-        <w:t>Many of the plots and summary tables in this dashboard show ratios for volumetric water content (VWC) and electrical conductivity (EC). These ratios compare one strip or logger location to another (for example, S1/S2) and are often useful for seeing treatment effects or spatial differences. In contrast, we do not compute or display ratios for temperature variables.</w:t>
+        <w:t>Many of the plots and summary tables in this dashboard show ratios for volumetric water content (VWC) and bulk electrical conductivity (bulk EC). These ratios compare one strip or logger location to another (for example, S1/S2) and are often useful for seeing treatment effects or spatial differences. Bulk EC ratios are ratios of sensor readings and remain sensitive to differences in soil water content and temperature; they are not direct ratios of pore-water salinity. In contrast, we do not compute or display ratios for temperature variables.</w:t>
       </w:r>
     </w:p>
     <w:p>

</xml_diff>